<commit_message>
All Changes in Report
</commit_message>
<xml_diff>
--- a/Report (latest).docx
+++ b/Report (latest).docx
@@ -1,6 +1,6 @@
 
 <file path=word/document.xml><?xml version="1.0" encoding="utf-8"?>
-<w:document xmlns:cx="http://schemas.microsoft.com/office/drawing/2014/chartex" xmlns:cx1="http://schemas.microsoft.com/office/drawing/2015/9/8/chartex" xmlns:cx2="http://schemas.microsoft.com/office/drawing/2015/10/21/chartex" xmlns:cx3="http://schemas.microsoft.com/office/drawing/2016/5/9/chartex" xmlns:cx4="http://schemas.microsoft.com/office/drawing/2016/5/10/chartex" xmlns:cx5="http://schemas.microsoft.com/office/drawing/2016/5/11/chartex" xmlns:cx6="http://schemas.microsoft.com/office/drawing/2016/5/12/chartex" xmlns:cx7="http://schemas.microsoft.com/office/drawing/2016/5/13/chartex" xmlns:cx8="http://schemas.microsoft.com/office/drawing/2016/5/14/chartex" xmlns:mc="http://schemas.openxmlformats.org/markup-compatibility/2006" xmlns:aink="http://schemas.microsoft.com/office/drawing/2016/ink" xmlns:am3d="http://schemas.microsoft.com/office/drawing/2017/model3d" xmlns:o="urn:schemas-microsoft-com:office:office" xmlns:oel="http://schemas.microsoft.com/office/2019/extlst" xmlns:r="http://purl.oclc.org/ooxml/officeDocument/relationships" xmlns:m="http://purl.oclc.org/ooxml/officeDocument/math" xmlns:v="urn:schemas-microsoft-com:vml" xmlns:wp14="http://schemas.microsoft.com/office/word/2010/wordprocessingDrawing" xmlns:wp="http://purl.oclc.org/ooxml/drawingml/wordprocessingDrawing" xmlns:w10="urn:schemas-microsoft-com:office:word" xmlns:w="http://purl.oclc.org/ooxml/wordprocessingml/main" xmlns:w14="http://schemas.microsoft.com/office/word/2010/wordml" xmlns:w15="http://schemas.microsoft.com/office/word/2012/wordml" xmlns:w16cex="http://schemas.microsoft.com/office/word/2018/wordml/cex" xmlns:w16cid="http://schemas.microsoft.com/office/word/2016/wordml/cid" xmlns:w16="http://schemas.microsoft.com/office/word/2018/wordml" xmlns:w16du="http://schemas.microsoft.com/office/word/2023/wordml/word16du" xmlns:w16sdtdh="http://schemas.microsoft.com/office/word/2020/wordml/sdtdatahash" xmlns:w16sdtfl="http://schemas.microsoft.com/office/word/2024/wordml/sdtformatlock" xmlns:w16se="http://schemas.microsoft.com/office/word/2015/wordml/symex" xmlns:wpi="http://schemas.microsoft.com/office/word/2010/wordprocessingInk" xmlns:wne="http://schemas.microsoft.com/office/word/2006/wordml" mc:Ignorable="w14 w15 w16se w16cid w16 w16cex w16sdtdh w16sdtfl w16du wne wp14" w:conformance="strict">
+<w:document xmlns:cx="http://schemas.microsoft.com/office/drawing/2014/chartex" xmlns:cx1="http://schemas.microsoft.com/office/drawing/2015/9/8/chartex" xmlns:cx2="http://schemas.microsoft.com/office/drawing/2015/10/21/chartex" xmlns:cx3="http://schemas.microsoft.com/office/drawing/2016/5/9/chartex" xmlns:cx4="http://schemas.microsoft.com/office/drawing/2016/5/10/chartex" xmlns:cx5="http://schemas.microsoft.com/office/drawing/2016/5/11/chartex" xmlns:cx6="http://schemas.microsoft.com/office/drawing/2016/5/12/chartex" xmlns:cx7="http://schemas.microsoft.com/office/drawing/2016/5/13/chartex" xmlns:cx8="http://schemas.microsoft.com/office/drawing/2016/5/14/chartex" xmlns:mc="http://schemas.openxmlformats.org/markup-compatibility/2006" xmlns:aink="http://schemas.microsoft.com/office/drawing/2016/ink" xmlns:am3d="http://schemas.microsoft.com/office/drawing/2017/model3d" xmlns:o="urn:schemas-microsoft-com:office:office" xmlns:r="http://purl.oclc.org/ooxml/officeDocument/relationships" xmlns:m="http://purl.oclc.org/ooxml/officeDocument/math" xmlns:v="urn:schemas-microsoft-com:vml" xmlns:wp14="http://schemas.microsoft.com/office/word/2010/wordprocessingDrawing" xmlns:wp="http://purl.oclc.org/ooxml/drawingml/wordprocessingDrawing" xmlns:w10="urn:schemas-microsoft-com:office:word" xmlns:w="http://purl.oclc.org/ooxml/wordprocessingml/main" xmlns:w14="http://schemas.microsoft.com/office/word/2010/wordml" xmlns:w15="http://schemas.microsoft.com/office/word/2012/wordml" xmlns:w16cex="http://schemas.microsoft.com/office/word/2018/wordml/cex" xmlns:w16cid="http://schemas.microsoft.com/office/word/2016/wordml/cid" xmlns:w16="http://schemas.microsoft.com/office/word/2018/wordml" xmlns:w16sdtdh="http://schemas.microsoft.com/office/word/2020/wordml/sdtdatahash" xmlns:w16se="http://schemas.microsoft.com/office/word/2015/wordml/symex" xmlns:wpi="http://schemas.microsoft.com/office/word/2010/wordprocessingInk" xmlns:wne="http://schemas.microsoft.com/office/word/2006/wordml" mc:Ignorable="w14 w15 w16se w16cid w16 w16cex w16sdtdh wne wp14" w:conformance="strict">
   <w:body>
     <w:p>
       <w:pPr>
@@ -171,30 +171,28 @@
           <w:sz w:val="18"/>
           <w:szCs w:val="18"/>
         </w:rPr>
-        <w:t>line 1: 4</w:t>
+        <w:br w:type="column"/>
       </w:r>
       <w:r>
         <w:rPr>
           <w:sz w:val="18"/>
           <w:szCs w:val="18"/>
-          <w:vertAlign w:val="superscript"/>
-        </w:rPr>
-        <w:t>th</w:t>
+        </w:rPr>
+        <w:t>Humzah Zahid Malik</w:t>
       </w:r>
       <w:r>
         <w:rPr>
           <w:sz w:val="18"/>
           <w:szCs w:val="18"/>
         </w:rPr>
-        <w:t xml:space="preserve"> Given Name Surname</w:t>
+        <w:br/>
       </w:r>
       <w:r>
         <w:rPr>
           <w:sz w:val="18"/>
           <w:szCs w:val="18"/>
         </w:rPr>
-        <w:br/>
-        <w:t xml:space="preserve">line 2: </w:t>
+        <w:t>Dept. of Computer Science</w:t>
       </w:r>
       <w:r>
         <w:rPr>
@@ -202,14 +200,7 @@
           <w:sz w:val="18"/>
           <w:szCs w:val="18"/>
         </w:rPr>
-        <w:t>dept. name of organization</w:t>
-      </w:r>
-      <w:r>
-        <w:rPr>
-          <w:sz w:val="18"/>
-          <w:szCs w:val="18"/>
-        </w:rPr>
-        <w:br/>
+        <w:t xml:space="preserve"> </w:t>
       </w:r>
       <w:r>
         <w:rPr>
@@ -217,16 +208,29 @@
           <w:sz w:val="18"/>
           <w:szCs w:val="18"/>
         </w:rPr>
-        <w:t xml:space="preserve">(of </w:t>
-      </w:r>
-      <w:r>
-        <w:rPr>
-          <w:i/>
+        <w:t>–</w:t>
+      </w:r>
+      <w:r>
+        <w:rPr>
           <w:iCs/>
           <w:sz w:val="18"/>
           <w:szCs w:val="18"/>
         </w:rPr>
-        <w:t>Affiliation</w:t>
+        <w:t xml:space="preserve"> Faculty of Science</w:t>
+      </w:r>
+      <w:r>
+        <w:rPr>
+          <w:sz w:val="18"/>
+          <w:szCs w:val="18"/>
+        </w:rPr>
+        <w:br/>
+      </w:r>
+      <w:r>
+        <w:rPr>
+          <w:sz w:val="18"/>
+          <w:szCs w:val="18"/>
+        </w:rPr>
+        <w:t>University of Western Ontario</w:t>
       </w:r>
       <w:r>
         <w:rPr>
@@ -234,15 +238,7 @@
           <w:sz w:val="18"/>
           <w:szCs w:val="18"/>
         </w:rPr>
-        <w:t>)</w:t>
-      </w:r>
-      <w:r>
-        <w:rPr>
-          <w:sz w:val="18"/>
-          <w:szCs w:val="18"/>
-        </w:rPr>
-        <w:br/>
-        <w:t xml:space="preserve">line 3: </w:t>
+        <w:t xml:space="preserve"> </w:t>
       </w:r>
       <w:r>
         <w:rPr>
@@ -250,83 +246,7 @@
           <w:sz w:val="18"/>
           <w:szCs w:val="18"/>
         </w:rPr>
-        <w:t xml:space="preserve">name of organization </w:t>
-      </w:r>
-      <w:r>
-        <w:rPr>
-          <w:i/>
-          <w:sz w:val="18"/>
-          <w:szCs w:val="18"/>
-        </w:rPr>
         <w:br/>
-        <w:t>(of Affiliation)</w:t>
-      </w:r>
-      <w:r>
-        <w:rPr>
-          <w:i/>
-          <w:sz w:val="18"/>
-          <w:szCs w:val="18"/>
-        </w:rPr>
-        <w:br/>
-      </w:r>
-      <w:r>
-        <w:rPr>
-          <w:sz w:val="18"/>
-          <w:szCs w:val="18"/>
-        </w:rPr>
-        <w:t>line 4: City, Country</w:t>
-      </w:r>
-      <w:r>
-        <w:rPr>
-          <w:sz w:val="18"/>
-          <w:szCs w:val="18"/>
-        </w:rPr>
-        <w:br/>
-        <w:t>line 5: email address  or ORCID</w:t>
-      </w:r>
-      <w:r>
-        <w:rPr>
-          <w:sz w:val="18"/>
-          <w:szCs w:val="18"/>
-        </w:rPr>
-        <w:br w:type="column"/>
-      </w:r>
-      <w:r>
-        <w:rPr>
-          <w:sz w:val="18"/>
-          <w:szCs w:val="18"/>
-        </w:rPr>
-        <w:t>Humzah Zahid Malik</w:t>
-      </w:r>
-      <w:r>
-        <w:rPr>
-          <w:sz w:val="18"/>
-          <w:szCs w:val="18"/>
-        </w:rPr>
-        <w:br/>
-      </w:r>
-      <w:r>
-        <w:rPr>
-          <w:sz w:val="18"/>
-          <w:szCs w:val="18"/>
-        </w:rPr>
-        <w:t>Dept. of Computer Science</w:t>
-      </w:r>
-      <w:r>
-        <w:rPr>
-          <w:i/>
-          <w:sz w:val="18"/>
-          <w:szCs w:val="18"/>
-        </w:rPr>
-        <w:t xml:space="preserve"> </w:t>
-      </w:r>
-      <w:r>
-        <w:rPr>
-          <w:i/>
-          <w:sz w:val="18"/>
-          <w:szCs w:val="18"/>
-        </w:rPr>
-        <w:t>–</w:t>
       </w:r>
       <w:r>
         <w:rPr>
@@ -334,7 +254,7 @@
           <w:sz w:val="18"/>
           <w:szCs w:val="18"/>
         </w:rPr>
-        <w:t xml:space="preserve"> Faculty of Science</w:t>
+        <w:t>London, Canada</w:t>
       </w:r>
       <w:r>
         <w:rPr>
@@ -348,31 +268,31 @@
           <w:sz w:val="18"/>
           <w:szCs w:val="18"/>
         </w:rPr>
-        <w:t>University of Western Ontario</w:t>
-      </w:r>
-      <w:r>
-        <w:rPr>
-          <w:i/>
+        <w:t>hmalik66@uwo.ca</w:t>
+      </w:r>
+    </w:p>
+    <w:p>
+      <w:pPr>
+        <w:pStyle w:val="Author"/>
+        <w:spacing w:before="5pt" w:beforeAutospacing="1"/>
+        <w:rPr>
           <w:sz w:val="18"/>
           <w:szCs w:val="18"/>
         </w:rPr>
-        <w:t xml:space="preserve"> </w:t>
-      </w:r>
-      <w:r>
-        <w:rPr>
-          <w:i/>
+      </w:pPr>
+      <w:r>
+        <w:rPr>
           <w:sz w:val="18"/>
           <w:szCs w:val="18"/>
         </w:rPr>
-        <w:br/>
-      </w:r>
-      <w:r>
-        <w:rPr>
-          <w:iCs/>
+        <w:br w:type="column"/>
+      </w:r>
+      <w:r>
+        <w:rPr>
           <w:sz w:val="18"/>
           <w:szCs w:val="18"/>
         </w:rPr>
-        <w:t>London, Canada</w:t>
+        <w:t>Aakarsh Garg</w:t>
       </w:r>
       <w:r>
         <w:rPr>
@@ -380,146 +300,70 @@
           <w:szCs w:val="18"/>
         </w:rPr>
         <w:br/>
+        <w:t>Dept. of Computer Science</w:t>
       </w:r>
       <w:r>
         <w:rPr>
           <w:sz w:val="18"/>
           <w:szCs w:val="18"/>
         </w:rPr>
-        <w:t>hmalik66@uwo.ca</w:t>
+        <w:br/>
+        <w:t>Faculty of Computer Science</w:t>
+      </w:r>
+      <w:r>
+        <w:rPr>
+          <w:sz w:val="18"/>
+          <w:szCs w:val="18"/>
+        </w:rPr>
+        <w:br/>
+      </w:r>
+      <w:r>
+        <w:rPr>
+          <w:sz w:val="18"/>
+          <w:szCs w:val="18"/>
+        </w:rPr>
+        <w:t>University of Western Ontario</w:t>
+      </w:r>
+      <w:r>
+        <w:rPr>
+          <w:sz w:val="18"/>
+          <w:szCs w:val="18"/>
+        </w:rPr>
+        <w:t xml:space="preserve"> </w:t>
+      </w:r>
+      <w:r>
+        <w:rPr>
+          <w:sz w:val="18"/>
+          <w:szCs w:val="18"/>
+        </w:rPr>
+        <w:br/>
+      </w:r>
+      <w:r>
+        <w:rPr>
+          <w:sz w:val="18"/>
+          <w:szCs w:val="18"/>
+        </w:rPr>
+        <w:t>London, Canada</w:t>
+      </w:r>
+      <w:r>
+        <w:rPr>
+          <w:sz w:val="18"/>
+          <w:szCs w:val="18"/>
+        </w:rPr>
+        <w:br/>
+      </w:r>
+      <w:r>
+        <w:rPr>
+          <w:sz w:val="18"/>
+          <w:szCs w:val="18"/>
+        </w:rPr>
+        <w:t>agarg85@uwo.ca</w:t>
       </w:r>
     </w:p>
     <w:p>
       <w:pPr>
         <w:pStyle w:val="Author"/>
         <w:spacing w:before="5pt" w:beforeAutospacing="1"/>
-        <w:rPr>
-          <w:sz w:val="18"/>
-          <w:szCs w:val="18"/>
-        </w:rPr>
-      </w:pPr>
-      <w:r>
-        <w:rPr>
-          <w:sz w:val="18"/>
-          <w:szCs w:val="18"/>
-        </w:rPr>
-        <w:br w:type="column"/>
-      </w:r>
-      <w:r>
-        <w:rPr>
-          <w:sz w:val="18"/>
-          <w:szCs w:val="18"/>
-        </w:rPr>
-        <w:t>line 1: 3</w:t>
-      </w:r>
-      <w:r>
-        <w:rPr>
-          <w:sz w:val="18"/>
-          <w:szCs w:val="18"/>
-          <w:vertAlign w:val="superscript"/>
-        </w:rPr>
-        <w:t>rd</w:t>
-      </w:r>
-      <w:r>
-        <w:rPr>
-          <w:sz w:val="18"/>
-          <w:szCs w:val="18"/>
-        </w:rPr>
-        <w:t xml:space="preserve"> Given Name Surname</w:t>
-      </w:r>
-      <w:r>
-        <w:rPr>
-          <w:sz w:val="18"/>
-          <w:szCs w:val="18"/>
-        </w:rPr>
-        <w:br/>
-        <w:t xml:space="preserve">line 2: </w:t>
-      </w:r>
-      <w:r>
-        <w:rPr>
-          <w:i/>
-          <w:sz w:val="18"/>
-          <w:szCs w:val="18"/>
-        </w:rPr>
-        <w:t xml:space="preserve">dept. name of organization </w:t>
-      </w:r>
-      <w:r>
-        <w:rPr>
-          <w:i/>
-          <w:sz w:val="18"/>
-          <w:szCs w:val="18"/>
-        </w:rPr>
-        <w:br/>
-        <w:t xml:space="preserve">(of </w:t>
-      </w:r>
-      <w:r>
-        <w:rPr>
-          <w:i/>
-          <w:iCs/>
-          <w:sz w:val="18"/>
-          <w:szCs w:val="18"/>
-        </w:rPr>
-        <w:t>Affiliation</w:t>
-      </w:r>
-      <w:r>
-        <w:rPr>
-          <w:i/>
-          <w:sz w:val="18"/>
-          <w:szCs w:val="18"/>
-        </w:rPr>
-        <w:t>)</w:t>
-      </w:r>
-      <w:r>
-        <w:rPr>
-          <w:sz w:val="18"/>
-          <w:szCs w:val="18"/>
-        </w:rPr>
-        <w:br/>
-        <w:t xml:space="preserve">line 3: </w:t>
-      </w:r>
-      <w:r>
-        <w:rPr>
-          <w:i/>
-          <w:sz w:val="18"/>
-          <w:szCs w:val="18"/>
-        </w:rPr>
-        <w:t xml:space="preserve">name of organization </w:t>
-      </w:r>
-      <w:r>
-        <w:rPr>
-          <w:i/>
-          <w:sz w:val="18"/>
-          <w:szCs w:val="18"/>
-        </w:rPr>
-        <w:br/>
-        <w:t>(of Affiliation)</w:t>
-      </w:r>
-      <w:r>
-        <w:rPr>
-          <w:i/>
-          <w:sz w:val="18"/>
-          <w:szCs w:val="18"/>
-        </w:rPr>
-        <w:br/>
-      </w:r>
-      <w:r>
-        <w:rPr>
-          <w:sz w:val="18"/>
-          <w:szCs w:val="18"/>
-        </w:rPr>
-        <w:t>line 4: City, Country</w:t>
-      </w:r>
-      <w:r>
-        <w:rPr>
-          <w:sz w:val="18"/>
-          <w:szCs w:val="18"/>
-        </w:rPr>
-        <w:br/>
-        <w:t>line 5: email address or ORCID</w:t>
-      </w:r>
-    </w:p>
-    <w:p>
-      <w:pPr>
         <w:sectPr>
           <w:type w:val="continuous"/>
           <w:pgSz w:w="595.30pt" w:h="841.90pt" w:code="9"/>
@@ -570,7 +414,13 @@
         <w:t xml:space="preserve"> </w:t>
       </w:r>
       <w:r>
-        <w:t>This project investigates the use of machine learning techniques to predict financial losses resulting from cybersecurity incidents. Using a publicly available dataset containing features such as attack type, number of affected users, target industry, and incident resolution time, we developed and evaluated several regression models including Linear Regression, Decision Tree Regression, K-Nearest Neighbours, Gradient Boosting, and Random Forest. Exploratory data analysis showed that the numerical features were broadly distributed and approximately symmetric, while correlations with the target variable were close to zero. Despite applying appropriate preprocessing and testing multiple modeling approaches, all regression models demonstrated limited predictive performance and performed only marginally differently from simple baseline predictors. Additional experiments using classification and feature interaction engineering also failed to produce meaningful improvement. These findings suggest that the dataset contains limited predictive signal for financial loss estimation, highlighting the challenges of modeling complex real-world outcomes and the importance of rigorous analysis even when strong predictive performance is not achieved.</w:t>
+        <w:t xml:space="preserve">This project investigates the use of machine learning techniques to predict financial losses resulting from cybersecurity incidents. Using a publicly available dataset containing features such as attack type, number of affected users, target industry, and incident resolution time, we developed and evaluated several regression models including Linear Regression, Decision Tree Regression, K-Nearest Neighbours, Gradient Boosting, and Random Forest. Exploratory data analysis showed that the numerical features were broadly distributed and approximately symmetric, while correlations with the target variable were close to zero. Despite applying appropriate preprocessing and testing multiple modeling approaches, all regression models demonstrated limited predictive performance and performed only marginally </w:t>
+      </w:r>
+      <w:r>
+        <w:t>differently from simple baseline predictors. Additional</w:t>
+      </w:r>
+      <w:r>
+        <w:t xml:space="preserve"> experiments using classification and feature interaction engineering also failed to produce meaningful improvement. These findings suggest that the dataset contains limited predictive signal for financial loss estimation, highlighting the challenges of modeling complex real-world outcomes and the importance of rigorous analysis even when strong predictive performance is not achieved.</w:t>
       </w:r>
     </w:p>
     <w:p>
@@ -614,13 +464,7 @@
         <w:rPr>
           <w:lang w:val="en-US"/>
         </w:rPr>
-        <w:t xml:space="preserve">However, predicting financial loss is inherently challenging due to the complex and often unpredictable nature of cyberattacks. Factors such as attack sophistication, response time, and system vulnerabilities may not be fully </w:t>
-      </w:r>
-      <w:r>
-        <w:rPr>
-          <w:lang w:val="en-US"/>
-        </w:rPr>
-        <w:t>captured in available datasets. As a result, machine learning models may struggle to identify strong predictive patterns.</w:t>
+        <w:t>However, predicting financial loss is inherently challenging due to the complex and often unpredictable nature of cyberattacks. Factors such as attack sophistication, response time, and system vulnerabilities may not be fully captured in available datasets. As a result, machine learning models may struggle to identify strong predictive patterns.</w:t>
       </w:r>
     </w:p>
     <w:p>
@@ -771,7 +615,6 @@
         <w:pStyle w:val="Heading1"/>
       </w:pPr>
       <w:r>
-        <w:lastRenderedPageBreak/>
         <w:t>Dataset description and Exploratory data analysis</w:t>
       </w:r>
     </w:p>
@@ -860,6 +703,7 @@
         <w:rPr>
           <w:lang w:val="en-US"/>
         </w:rPr>
+        <w:lastRenderedPageBreak/>
         <w:t>Target Industry: Industry sector affected</w:t>
       </w:r>
     </w:p>
@@ -1166,13 +1010,7 @@
         <w:rPr>
           <w:lang w:val="en-US"/>
         </w:rPr>
-        <w:t xml:space="preserve"> showed broadly similar distributions, with no category displaying a clearly distinct or dominant pattern (see Figs. 5, 6, and 9 in Appendix). Average </w:t>
-      </w:r>
-      <w:r>
-        <w:rPr>
-          <w:lang w:val="en-US"/>
-        </w:rPr>
-        <w:t>financial losses across attack types also varied only slightly (see Fig. 10 in Appendix), suggesting that categorical group membership alone was unlikely to provide strong predictive power.</w:t>
+        <w:t xml:space="preserve"> showed broadly similar distributions, with no category displaying a clearly distinct or dominant pattern (see Figs. 5, 6, and 9 in Appendix). Average financial losses across attack types also varied only slightly (see Fig. 10 in Appendix), suggesting that categorical group membership alone was unlikely to provide strong predictive power.</w:t>
       </w:r>
     </w:p>
     <w:p>
@@ -1632,7 +1470,6 @@
         <w:jc w:val="both"/>
       </w:pPr>
       <w:r>
-        <w:lastRenderedPageBreak/>
         <w:t>Gradient Boosting Regression</w:t>
       </w:r>
     </w:p>
@@ -1743,6 +1580,7 @@
         <w:jc w:val="both"/>
       </w:pPr>
       <w:r>
+        <w:lastRenderedPageBreak/>
         <w:t>Medium</w:t>
       </w:r>
     </w:p>
@@ -2527,11 +2365,40 @@
         <w:jc w:val="both"/>
       </w:pPr>
       <w:r>
-        <w:t xml:space="preserve">The classification reformulation provided an additional check. If exact dollar-value prediction had been too difficult, broader category prediction might still have succeeded. However, both classifiers performed near chance </w:t>
-      </w:r>
+        <w:t xml:space="preserve">The classification reformulation provided an additional check. If exact dollar-value prediction had been too difficult, broader category prediction might still have succeeded. However, both classifiers performed near chance level, showing that even coarse class boundaries were not well explained by the available features. </w:t>
+      </w:r>
+    </w:p>
+    <w:p>
+      <w:pPr>
+        <w:ind w:firstLine="36pt"/>
+        <w:jc w:val="both"/>
+      </w:pPr>
+      <w:r>
+        <w:t>Similarly, the interaction experiment tested whether hidden structure might emerge when combining attack type with target industry. The slight drop in performance after adding this feature suggests that these interactions do not provide meaningful additional signal in the dataset.</w:t>
+      </w:r>
+    </w:p>
+    <w:p>
+      <w:pPr>
+        <w:ind w:firstLine="36pt"/>
+        <w:jc w:val="both"/>
+      </w:pPr>
+      <w:r>
+        <w:t>Taken together, these findings imply that important explanatory variables may be missing. Financial loss in real-world cybersecurity incidents is likely influenced by factors such as organizational size, preparedness, recovery costs, severity of service disruption, legal consequences, and reputational damage. Since these factors are not represented here, the observed weak predictive performance is both understandable and informative.</w:t>
+      </w:r>
+    </w:p>
+    <w:p>
+      <w:pPr>
+        <w:ind w:firstLine="36pt"/>
+        <w:jc w:val="both"/>
+      </w:pPr>
+    </w:p>
+    <w:p>
+      <w:pPr>
+        <w:pStyle w:val="Heading1"/>
+      </w:pPr>
       <w:r>
         <w:lastRenderedPageBreak/>
-        <w:t xml:space="preserve">level, showing that even coarse class boundaries were not well explained by the available features. </w:t>
+        <w:t>Conclusion</w:t>
       </w:r>
     </w:p>
     <w:p>
@@ -2540,7 +2407,7 @@
         <w:jc w:val="both"/>
       </w:pPr>
       <w:r>
-        <w:t>Similarly, the interaction experiment tested whether hidden structure might emerge when combining attack type with target industry. The slight drop in performance after adding this feature suggests that these interactions do not provide meaningful additional signal in the dataset.</w:t>
+        <w:t xml:space="preserve">This project explored the use of machine learning to predict financial loss from cybersecurity incidents using a public dataset containing numerical and categorical incident-related features. Multiple regression models were evaluated and compared against baseline predictors, and additional experiments involving classification and feature interaction engineering were performed. </w:t>
       </w:r>
     </w:p>
     <w:p>
@@ -2549,7 +2416,7 @@
         <w:jc w:val="both"/>
       </w:pPr>
       <w:r>
-        <w:t>Taken together, these findings imply that important explanatory variables may be missing. Financial loss in real-world cybersecurity incidents is likely influenced by factors such as organizational size, preparedness, recovery costs, severity of service disruption, legal consequences, and reputational damage. Since these factors are not represented here, the observed weak predictive performance is both understandable and informative.</w:t>
+        <w:t xml:space="preserve">Across all experiments, performance remained weak. The best regression model, Random Forest, only marginally differed from the baseline, while classification models performed close to random guessing. These results strongly suggest that the available features contain limited predictive signal for financial loss estimation. </w:t>
       </w:r>
     </w:p>
     <w:p>
@@ -2557,38 +2424,6 @@
         <w:ind w:firstLine="36pt"/>
         <w:jc w:val="both"/>
       </w:pPr>
-    </w:p>
-    <w:p>
-      <w:pPr>
-        <w:pStyle w:val="Heading1"/>
-      </w:pPr>
-      <w:r>
-        <w:t>Conclusion</w:t>
-      </w:r>
-    </w:p>
-    <w:p>
-      <w:pPr>
-        <w:ind w:firstLine="36pt"/>
-        <w:jc w:val="both"/>
-      </w:pPr>
-      <w:r>
-        <w:t xml:space="preserve">This project explored the use of machine learning to predict financial loss from cybersecurity incidents using a public dataset containing numerical and categorical incident-related features. Multiple regression models were evaluated and compared against baseline predictors, and additional experiments involving classification and feature interaction engineering were performed. </w:t>
-      </w:r>
-    </w:p>
-    <w:p>
-      <w:pPr>
-        <w:ind w:firstLine="36pt"/>
-        <w:jc w:val="both"/>
-      </w:pPr>
-      <w:r>
-        <w:t xml:space="preserve">Across all experiments, performance remained weak. The best regression model, Random Forest, only marginally differed from the baseline, while classification models performed close to random guessing. These results strongly suggest that the available features contain limited predictive signal for financial loss estimation. </w:t>
-      </w:r>
-    </w:p>
-    <w:p>
-      <w:pPr>
-        <w:ind w:firstLine="36pt"/>
-        <w:jc w:val="both"/>
-      </w:pPr>
       <w:r>
         <w:t>Although strong predictive accuracy was not achieved, the project still provides a meaningful result. It demonstrates that rigorous preprocessing, comparative modeling, and careful interpretation are essential in machine learning, especially when the data itself may not contain enough information to support reliable prediction.</w:t>
       </w:r>
@@ -2598,7 +2433,7 @@
     </w:p>
     <w:p>
       <w:pPr>
-        <w:ind w:start="-12.40pt" w:firstLine="14.40pt"/>
+        <w:ind w:start="-11.60pt" w:firstLine="14.40pt"/>
         <w:jc w:val="both"/>
       </w:pPr>
     </w:p>
@@ -2979,7 +2814,6 @@
         <w:rPr>
           <w:noProof/>
         </w:rPr>
-        <w:lastRenderedPageBreak/>
         <w:drawing>
           <wp:inline distT="0" distB="0" distL="0" distR="0" wp14:anchorId="6B403B42" wp14:editId="73DA4B67">
             <wp:extent cx="2781414" cy="1816100"/>
@@ -3030,7 +2864,15 @@
           <w:sz w:val="16"/>
           <w:szCs w:val="16"/>
         </w:rPr>
-        <w:t>Fig. 5. Boxplot: Financial Loss by Attack Type</w:t>
+        <w:t xml:space="preserve">Fig. 5. </w:t>
+      </w:r>
+      <w:r>
+        <w:rPr>
+          <w:i/>
+          <w:sz w:val="16"/>
+          <w:szCs w:val="16"/>
+        </w:rPr>
+        <w:t>Boxplot: Financial Loss by Attack Type</w:t>
       </w:r>
     </w:p>
     <w:p>
@@ -3041,6 +2883,7 @@
         <w:rPr>
           <w:noProof/>
         </w:rPr>
+        <w:lastRenderedPageBreak/>
         <w:drawing>
           <wp:inline distT="0" distB="0" distL="0" distR="0" wp14:anchorId="793AB6EE" wp14:editId="5C88C0A5">
             <wp:extent cx="2921000" cy="1945042"/>
@@ -3335,7 +3178,15 @@
           <w:sz w:val="16"/>
           <w:szCs w:val="16"/>
         </w:rPr>
-        <w:t>Fig. 10. Average Financial Loss by Attack Type</w:t>
+        <w:t>Fig. 10. Average Financi</w:t>
+      </w:r>
+      <w:r>
+        <w:rPr>
+          <w:i/>
+          <w:sz w:val="16"/>
+          <w:szCs w:val="16"/>
+        </w:rPr>
+        <w:t>al Loss by Attack Type</w:t>
       </w:r>
     </w:p>
     <w:p>
@@ -3468,7 +3319,6 @@
         <w:rPr>
           <w:noProof/>
         </w:rPr>
-        <w:lastRenderedPageBreak/>
         <w:drawing>
           <wp:inline distT="0" distB="0" distL="0" distR="0" wp14:anchorId="3AC4B314" wp14:editId="2716E92C">
             <wp:extent cx="2921000" cy="1782535"/>
@@ -3530,6 +3380,7 @@
         <w:rPr>
           <w:noProof/>
         </w:rPr>
+        <w:lastRenderedPageBreak/>
         <w:drawing>
           <wp:inline distT="0" distB="0" distL="0" distR="0" wp14:anchorId="34FC0DD5" wp14:editId="44AB7DD8">
             <wp:extent cx="2921000" cy="1740797"/>
@@ -3580,7 +3431,15 @@
           <w:sz w:val="16"/>
           <w:szCs w:val="16"/>
         </w:rPr>
-        <w:t>Fig. 14. Top 15 Random Forest Feature Importances</w:t>
+        <w:t xml:space="preserve">Fig. 14. Top 15 Random Forest </w:t>
+      </w:r>
+      <w:r>
+        <w:rPr>
+          <w:i/>
+          <w:sz w:val="16"/>
+          <w:szCs w:val="16"/>
+        </w:rPr>
+        <w:t>Feature Importances</w:t>
       </w:r>
     </w:p>
     <w:p>
@@ -3806,15 +3665,7 @@
         <w:jc w:val="both"/>
       </w:pPr>
       <w:r>
-        <w:t xml:space="preserve">K-Nearest </w:t>
-      </w:r>
-      <w:proofErr w:type="spellStart"/>
-      <w:r>
-        <w:t>Neighbour</w:t>
-      </w:r>
-      <w:proofErr w:type="spellEnd"/>
-      <w:r>
-        <w:t xml:space="preserve"> Model in notebook</w:t>
+        <w:t>Contributed to project ideation and problem framing</w:t>
       </w:r>
     </w:p>
     <w:p>
@@ -3827,7 +3678,7 @@
         <w:jc w:val="both"/>
       </w:pPr>
       <w:r>
-        <w:t>Gradient Boosting Model in notebook</w:t>
+        <w:t>K-Nearest Neighbour Model in notebook</w:t>
       </w:r>
     </w:p>
     <w:p>
@@ -3840,7 +3691,7 @@
         <w:jc w:val="both"/>
       </w:pPr>
       <w:r>
-        <w:t>Model Analysis in notebook</w:t>
+        <w:t>Gradient Boosting Model in notebook</w:t>
       </w:r>
     </w:p>
     <w:p>
@@ -3853,6 +3704,22 @@
         <w:jc w:val="both"/>
       </w:pPr>
       <w:r>
+        <w:t>Model Analysis in notebook</w:t>
+      </w:r>
+    </w:p>
+    <w:p>
+      <w:pPr>
+        <w:pStyle w:val="ListParagraph"/>
+        <w:numPr>
+          <w:ilvl w:val="1"/>
+          <w:numId w:val="37"/>
+        </w:numPr>
+        <w:jc w:val="both"/>
+      </w:pPr>
+      <w:r>
+        <w:t xml:space="preserve">Generated </w:t>
+      </w:r>
+      <w:r>
         <w:t>Project Presentation Slides</w:t>
       </w:r>
     </w:p>
@@ -3894,6 +3761,96 @@
       <w:r>
         <w:t>Feature importance (for Random Forests) implementation and analysis in the notebook</w:t>
       </w:r>
+    </w:p>
+    <w:p>
+      <w:pPr>
+        <w:pStyle w:val="ListParagraph"/>
+        <w:numPr>
+          <w:ilvl w:val="0"/>
+          <w:numId w:val="37"/>
+        </w:numPr>
+        <w:jc w:val="both"/>
+      </w:pPr>
+      <w:proofErr w:type="spellStart"/>
+      <w:r>
+        <w:t>Aakarsh</w:t>
+      </w:r>
+      <w:proofErr w:type="spellEnd"/>
+      <w:r>
+        <w:t>:</w:t>
+      </w:r>
+    </w:p>
+    <w:p>
+      <w:pPr>
+        <w:pStyle w:val="ListParagraph"/>
+        <w:numPr>
+          <w:ilvl w:val="1"/>
+          <w:numId w:val="37"/>
+        </w:numPr>
+        <w:jc w:val="both"/>
+      </w:pPr>
+      <w:r>
+        <w:t>Contributed to project ideation and problem framing</w:t>
+      </w:r>
+    </w:p>
+    <w:p>
+      <w:pPr>
+        <w:pStyle w:val="ListParagraph"/>
+        <w:numPr>
+          <w:ilvl w:val="1"/>
+          <w:numId w:val="37"/>
+        </w:numPr>
+        <w:jc w:val="both"/>
+      </w:pPr>
+      <w:r>
+        <w:t>Implemented Linear Regression baseline model in notebook</w:t>
+      </w:r>
+    </w:p>
+    <w:p>
+      <w:pPr>
+        <w:pStyle w:val="ListParagraph"/>
+        <w:numPr>
+          <w:ilvl w:val="1"/>
+          <w:numId w:val="37"/>
+        </w:numPr>
+        <w:jc w:val="both"/>
+      </w:pPr>
+      <w:r>
+        <w:t>Evaluated model performance using MAE, RMSE, and R²</w:t>
+      </w:r>
+    </w:p>
+    <w:p>
+      <w:pPr>
+        <w:pStyle w:val="ListParagraph"/>
+        <w:numPr>
+          <w:ilvl w:val="1"/>
+          <w:numId w:val="37"/>
+        </w:numPr>
+        <w:jc w:val="both"/>
+      </w:pPr>
+      <w:r>
+        <w:t>Contributed to discussion of model performance and dataset limitations</w:t>
+      </w:r>
+    </w:p>
+    <w:p>
+      <w:pPr>
+        <w:pStyle w:val="ListParagraph"/>
+        <w:numPr>
+          <w:ilvl w:val="1"/>
+          <w:numId w:val="37"/>
+        </w:numPr>
+        <w:jc w:val="both"/>
+      </w:pPr>
+      <w:r>
+        <w:t>Designed presentation slides and delivered class presentation</w:t>
+      </w:r>
+    </w:p>
+    <w:p>
+      <w:pPr>
+        <w:pStyle w:val="ListParagraph"/>
+        <w:ind w:start="54pt"/>
+        <w:jc w:val="both"/>
+      </w:pPr>
     </w:p>
     <w:p>
       <w:pPr>
@@ -4026,7 +3983,7 @@
 </file>
 
 <file path=word/endnotes.xml><?xml version="1.0" encoding="utf-8"?>
-<w:endnotes xmlns:cx="http://schemas.microsoft.com/office/drawing/2014/chartex" xmlns:cx1="http://schemas.microsoft.com/office/drawing/2015/9/8/chartex" xmlns:cx2="http://schemas.microsoft.com/office/drawing/2015/10/21/chartex" xmlns:cx3="http://schemas.microsoft.com/office/drawing/2016/5/9/chartex" xmlns:cx4="http://schemas.microsoft.com/office/drawing/2016/5/10/chartex" xmlns:cx5="http://schemas.microsoft.com/office/drawing/2016/5/11/chartex" xmlns:cx6="http://schemas.microsoft.com/office/drawing/2016/5/12/chartex" xmlns:cx7="http://schemas.microsoft.com/office/drawing/2016/5/13/chartex" xmlns:cx8="http://schemas.microsoft.com/office/drawing/2016/5/14/chartex" xmlns:mc="http://schemas.openxmlformats.org/markup-compatibility/2006" xmlns:aink="http://schemas.microsoft.com/office/drawing/2016/ink" xmlns:am3d="http://schemas.microsoft.com/office/drawing/2017/model3d" xmlns:o="urn:schemas-microsoft-com:office:office" xmlns:oel="http://schemas.microsoft.com/office/2019/extlst" xmlns:r="http://purl.oclc.org/ooxml/officeDocument/relationships" xmlns:m="http://purl.oclc.org/ooxml/officeDocument/math" xmlns:v="urn:schemas-microsoft-com:vml" xmlns:wp14="http://schemas.microsoft.com/office/word/2010/wordprocessingDrawing" xmlns:wp="http://purl.oclc.org/ooxml/drawingml/wordprocessingDrawing" xmlns:w10="urn:schemas-microsoft-com:office:word" xmlns:w="http://purl.oclc.org/ooxml/wordprocessingml/main" xmlns:w14="http://schemas.microsoft.com/office/word/2010/wordml" xmlns:w15="http://schemas.microsoft.com/office/word/2012/wordml" xmlns:w16cex="http://schemas.microsoft.com/office/word/2018/wordml/cex" xmlns:w16cid="http://schemas.microsoft.com/office/word/2016/wordml/cid" xmlns:w16="http://schemas.microsoft.com/office/word/2018/wordml" xmlns:w16du="http://schemas.microsoft.com/office/word/2023/wordml/word16du" xmlns:w16sdtdh="http://schemas.microsoft.com/office/word/2020/wordml/sdtdatahash" xmlns:w16sdtfl="http://schemas.microsoft.com/office/word/2024/wordml/sdtformatlock" xmlns:w16se="http://schemas.microsoft.com/office/word/2015/wordml/symex" xmlns:wpi="http://schemas.microsoft.com/office/word/2010/wordprocessingInk" xmlns:wne="http://schemas.microsoft.com/office/word/2006/wordml" mc:Ignorable="w14 w15 w16se w16cid w16 w16cex w16sdtdh w16sdtfl w16du wne wp14">
+<w:endnotes xmlns:cx="http://schemas.microsoft.com/office/drawing/2014/chartex" xmlns:cx1="http://schemas.microsoft.com/office/drawing/2015/9/8/chartex" xmlns:cx2="http://schemas.microsoft.com/office/drawing/2015/10/21/chartex" xmlns:cx3="http://schemas.microsoft.com/office/drawing/2016/5/9/chartex" xmlns:cx4="http://schemas.microsoft.com/office/drawing/2016/5/10/chartex" xmlns:cx5="http://schemas.microsoft.com/office/drawing/2016/5/11/chartex" xmlns:cx6="http://schemas.microsoft.com/office/drawing/2016/5/12/chartex" xmlns:cx7="http://schemas.microsoft.com/office/drawing/2016/5/13/chartex" xmlns:cx8="http://schemas.microsoft.com/office/drawing/2016/5/14/chartex" xmlns:mc="http://schemas.openxmlformats.org/markup-compatibility/2006" xmlns:aink="http://schemas.microsoft.com/office/drawing/2016/ink" xmlns:am3d="http://schemas.microsoft.com/office/drawing/2017/model3d" xmlns:o="urn:schemas-microsoft-com:office:office" xmlns:r="http://purl.oclc.org/ooxml/officeDocument/relationships" xmlns:m="http://purl.oclc.org/ooxml/officeDocument/math" xmlns:v="urn:schemas-microsoft-com:vml" xmlns:wp14="http://schemas.microsoft.com/office/word/2010/wordprocessingDrawing" xmlns:wp="http://purl.oclc.org/ooxml/drawingml/wordprocessingDrawing" xmlns:w10="urn:schemas-microsoft-com:office:word" xmlns:w="http://purl.oclc.org/ooxml/wordprocessingml/main" xmlns:w14="http://schemas.microsoft.com/office/word/2010/wordml" xmlns:w15="http://schemas.microsoft.com/office/word/2012/wordml" xmlns:w16cex="http://schemas.microsoft.com/office/word/2018/wordml/cex" xmlns:w16cid="http://schemas.microsoft.com/office/word/2016/wordml/cid" xmlns:w16="http://schemas.microsoft.com/office/word/2018/wordml" xmlns:w16sdtdh="http://schemas.microsoft.com/office/word/2020/wordml/sdtdatahash" xmlns:w16se="http://schemas.microsoft.com/office/word/2015/wordml/symex" xmlns:wpi="http://schemas.microsoft.com/office/word/2010/wordprocessingInk" xmlns:wne="http://schemas.microsoft.com/office/word/2006/wordml" mc:Ignorable="w14 w15 w16se w16cid w16 w16cex w16sdtdh wne wp14">
   <w:endnote w:type="separator" w:id="-1">
     <w:p>
       <w:r>
@@ -4045,7 +4002,7 @@
 </file>
 
 <file path=word/footer1.xml><?xml version="1.0" encoding="utf-8"?>
-<w:ftr xmlns:cx="http://schemas.microsoft.com/office/drawing/2014/chartex" xmlns:cx1="http://schemas.microsoft.com/office/drawing/2015/9/8/chartex" xmlns:cx2="http://schemas.microsoft.com/office/drawing/2015/10/21/chartex" xmlns:cx3="http://schemas.microsoft.com/office/drawing/2016/5/9/chartex" xmlns:cx4="http://schemas.microsoft.com/office/drawing/2016/5/10/chartex" xmlns:cx5="http://schemas.microsoft.com/office/drawing/2016/5/11/chartex" xmlns:cx6="http://schemas.microsoft.com/office/drawing/2016/5/12/chartex" xmlns:cx7="http://schemas.microsoft.com/office/drawing/2016/5/13/chartex" xmlns:cx8="http://schemas.microsoft.com/office/drawing/2016/5/14/chartex" xmlns:mc="http://schemas.openxmlformats.org/markup-compatibility/2006" xmlns:aink="http://schemas.microsoft.com/office/drawing/2016/ink" xmlns:am3d="http://schemas.microsoft.com/office/drawing/2017/model3d" xmlns:o="urn:schemas-microsoft-com:office:office" xmlns:oel="http://schemas.microsoft.com/office/2019/extlst" xmlns:r="http://purl.oclc.org/ooxml/officeDocument/relationships" xmlns:m="http://purl.oclc.org/ooxml/officeDocument/math" xmlns:v="urn:schemas-microsoft-com:vml" xmlns:wp14="http://schemas.microsoft.com/office/word/2010/wordprocessingDrawing" xmlns:wp="http://purl.oclc.org/ooxml/drawingml/wordprocessingDrawing" xmlns:w10="urn:schemas-microsoft-com:office:word" xmlns:w="http://purl.oclc.org/ooxml/wordprocessingml/main" xmlns:w14="http://schemas.microsoft.com/office/word/2010/wordml" xmlns:w15="http://schemas.microsoft.com/office/word/2012/wordml" xmlns:w16cex="http://schemas.microsoft.com/office/word/2018/wordml/cex" xmlns:w16cid="http://schemas.microsoft.com/office/word/2016/wordml/cid" xmlns:w16="http://schemas.microsoft.com/office/word/2018/wordml" xmlns:w16du="http://schemas.microsoft.com/office/word/2023/wordml/word16du" xmlns:w16sdtdh="http://schemas.microsoft.com/office/word/2020/wordml/sdtdatahash" xmlns:w16sdtfl="http://schemas.microsoft.com/office/word/2024/wordml/sdtformatlock" xmlns:w16se="http://schemas.microsoft.com/office/word/2015/wordml/symex" xmlns:wpi="http://schemas.microsoft.com/office/word/2010/wordprocessingInk" xmlns:wne="http://schemas.microsoft.com/office/word/2006/wordml" mc:Ignorable="w14 w15 w16se w16cid w16 w16cex w16sdtdh w16sdtfl w16du wne wp14">
+<w:ftr xmlns:cx="http://schemas.microsoft.com/office/drawing/2014/chartex" xmlns:cx1="http://schemas.microsoft.com/office/drawing/2015/9/8/chartex" xmlns:cx2="http://schemas.microsoft.com/office/drawing/2015/10/21/chartex" xmlns:cx3="http://schemas.microsoft.com/office/drawing/2016/5/9/chartex" xmlns:cx4="http://schemas.microsoft.com/office/drawing/2016/5/10/chartex" xmlns:cx5="http://schemas.microsoft.com/office/drawing/2016/5/11/chartex" xmlns:cx6="http://schemas.microsoft.com/office/drawing/2016/5/12/chartex" xmlns:cx7="http://schemas.microsoft.com/office/drawing/2016/5/13/chartex" xmlns:cx8="http://schemas.microsoft.com/office/drawing/2016/5/14/chartex" xmlns:mc="http://schemas.openxmlformats.org/markup-compatibility/2006" xmlns:aink="http://schemas.microsoft.com/office/drawing/2016/ink" xmlns:am3d="http://schemas.microsoft.com/office/drawing/2017/model3d" xmlns:o="urn:schemas-microsoft-com:office:office" xmlns:r="http://purl.oclc.org/ooxml/officeDocument/relationships" xmlns:m="http://purl.oclc.org/ooxml/officeDocument/math" xmlns:v="urn:schemas-microsoft-com:vml" xmlns:wp14="http://schemas.microsoft.com/office/word/2010/wordprocessingDrawing" xmlns:wp="http://purl.oclc.org/ooxml/drawingml/wordprocessingDrawing" xmlns:w10="urn:schemas-microsoft-com:office:word" xmlns:w="http://purl.oclc.org/ooxml/wordprocessingml/main" xmlns:w14="http://schemas.microsoft.com/office/word/2010/wordml" xmlns:w15="http://schemas.microsoft.com/office/word/2012/wordml" xmlns:w16cex="http://schemas.microsoft.com/office/word/2018/wordml/cex" xmlns:w16cid="http://schemas.microsoft.com/office/word/2016/wordml/cid" xmlns:w16="http://schemas.microsoft.com/office/word/2018/wordml" xmlns:w16sdtdh="http://schemas.microsoft.com/office/word/2020/wordml/sdtdatahash" xmlns:w16se="http://schemas.microsoft.com/office/word/2015/wordml/symex" xmlns:wpi="http://schemas.microsoft.com/office/word/2010/wordprocessingInk" xmlns:wne="http://schemas.microsoft.com/office/word/2006/wordml" mc:Ignorable="w14 w15 w16se w16cid w16 w16cex w16sdtdh wne wp14">
   <w:p>
     <w:pPr>
       <w:pStyle w:val="Footer"/>
@@ -4060,7 +4017,7 @@
 </file>
 
 <file path=word/footnotes.xml><?xml version="1.0" encoding="utf-8"?>
-<w:footnotes xmlns:cx="http://schemas.microsoft.com/office/drawing/2014/chartex" xmlns:cx1="http://schemas.microsoft.com/office/drawing/2015/9/8/chartex" xmlns:cx2="http://schemas.microsoft.com/office/drawing/2015/10/21/chartex" xmlns:cx3="http://schemas.microsoft.com/office/drawing/2016/5/9/chartex" xmlns:cx4="http://schemas.microsoft.com/office/drawing/2016/5/10/chartex" xmlns:cx5="http://schemas.microsoft.com/office/drawing/2016/5/11/chartex" xmlns:cx6="http://schemas.microsoft.com/office/drawing/2016/5/12/chartex" xmlns:cx7="http://schemas.microsoft.com/office/drawing/2016/5/13/chartex" xmlns:cx8="http://schemas.microsoft.com/office/drawing/2016/5/14/chartex" xmlns:mc="http://schemas.openxmlformats.org/markup-compatibility/2006" xmlns:aink="http://schemas.microsoft.com/office/drawing/2016/ink" xmlns:am3d="http://schemas.microsoft.com/office/drawing/2017/model3d" xmlns:o="urn:schemas-microsoft-com:office:office" xmlns:oel="http://schemas.microsoft.com/office/2019/extlst" xmlns:r="http://purl.oclc.org/ooxml/officeDocument/relationships" xmlns:m="http://purl.oclc.org/ooxml/officeDocument/math" xmlns:v="urn:schemas-microsoft-com:vml" xmlns:wp14="http://schemas.microsoft.com/office/word/2010/wordprocessingDrawing" xmlns:wp="http://purl.oclc.org/ooxml/drawingml/wordprocessingDrawing" xmlns:w10="urn:schemas-microsoft-com:office:word" xmlns:w="http://purl.oclc.org/ooxml/wordprocessingml/main" xmlns:w14="http://schemas.microsoft.com/office/word/2010/wordml" xmlns:w15="http://schemas.microsoft.com/office/word/2012/wordml" xmlns:w16cex="http://schemas.microsoft.com/office/word/2018/wordml/cex" xmlns:w16cid="http://schemas.microsoft.com/office/word/2016/wordml/cid" xmlns:w16="http://schemas.microsoft.com/office/word/2018/wordml" xmlns:w16du="http://schemas.microsoft.com/office/word/2023/wordml/word16du" xmlns:w16sdtdh="http://schemas.microsoft.com/office/word/2020/wordml/sdtdatahash" xmlns:w16sdtfl="http://schemas.microsoft.com/office/word/2024/wordml/sdtformatlock" xmlns:w16se="http://schemas.microsoft.com/office/word/2015/wordml/symex" xmlns:wpi="http://schemas.microsoft.com/office/word/2010/wordprocessingInk" xmlns:wne="http://schemas.microsoft.com/office/word/2006/wordml" mc:Ignorable="w14 w15 w16se w16cid w16 w16cex w16sdtdh w16sdtfl w16du wne wp14">
+<w:footnotes xmlns:cx="http://schemas.microsoft.com/office/drawing/2014/chartex" xmlns:cx1="http://schemas.microsoft.com/office/drawing/2015/9/8/chartex" xmlns:cx2="http://schemas.microsoft.com/office/drawing/2015/10/21/chartex" xmlns:cx3="http://schemas.microsoft.com/office/drawing/2016/5/9/chartex" xmlns:cx4="http://schemas.microsoft.com/office/drawing/2016/5/10/chartex" xmlns:cx5="http://schemas.microsoft.com/office/drawing/2016/5/11/chartex" xmlns:cx6="http://schemas.microsoft.com/office/drawing/2016/5/12/chartex" xmlns:cx7="http://schemas.microsoft.com/office/drawing/2016/5/13/chartex" xmlns:cx8="http://schemas.microsoft.com/office/drawing/2016/5/14/chartex" xmlns:mc="http://schemas.openxmlformats.org/markup-compatibility/2006" xmlns:aink="http://schemas.microsoft.com/office/drawing/2016/ink" xmlns:am3d="http://schemas.microsoft.com/office/drawing/2017/model3d" xmlns:o="urn:schemas-microsoft-com:office:office" xmlns:r="http://purl.oclc.org/ooxml/officeDocument/relationships" xmlns:m="http://purl.oclc.org/ooxml/officeDocument/math" xmlns:v="urn:schemas-microsoft-com:vml" xmlns:wp14="http://schemas.microsoft.com/office/word/2010/wordprocessingDrawing" xmlns:wp="http://purl.oclc.org/ooxml/drawingml/wordprocessingDrawing" xmlns:w10="urn:schemas-microsoft-com:office:word" xmlns:w="http://purl.oclc.org/ooxml/wordprocessingml/main" xmlns:w14="http://schemas.microsoft.com/office/word/2010/wordml" xmlns:w15="http://schemas.microsoft.com/office/word/2012/wordml" xmlns:w16cex="http://schemas.microsoft.com/office/word/2018/wordml/cex" xmlns:w16cid="http://schemas.microsoft.com/office/word/2016/wordml/cid" xmlns:w16="http://schemas.microsoft.com/office/word/2018/wordml" xmlns:w16sdtdh="http://schemas.microsoft.com/office/word/2020/wordml/sdtdatahash" xmlns:w16se="http://schemas.microsoft.com/office/word/2015/wordml/symex" xmlns:wpi="http://schemas.microsoft.com/office/word/2010/wordprocessingInk" xmlns:wne="http://schemas.microsoft.com/office/word/2006/wordml" mc:Ignorable="w14 w15 w16se w16cid w16 w16cex w16sdtdh wne wp14">
   <w:footnote w:type="separator" w:id="-1">
     <w:p>
       <w:r>
@@ -4079,7 +4036,7 @@
 </file>
 
 <file path=word/numbering.xml><?xml version="1.0" encoding="utf-8"?>
-<w:numbering xmlns:cx="http://schemas.microsoft.com/office/drawing/2014/chartex" xmlns:cx1="http://schemas.microsoft.com/office/drawing/2015/9/8/chartex" xmlns:cx2="http://schemas.microsoft.com/office/drawing/2015/10/21/chartex" xmlns:cx3="http://schemas.microsoft.com/office/drawing/2016/5/9/chartex" xmlns:cx4="http://schemas.microsoft.com/office/drawing/2016/5/10/chartex" xmlns:cx5="http://schemas.microsoft.com/office/drawing/2016/5/11/chartex" xmlns:cx6="http://schemas.microsoft.com/office/drawing/2016/5/12/chartex" xmlns:cx7="http://schemas.microsoft.com/office/drawing/2016/5/13/chartex" xmlns:cx8="http://schemas.microsoft.com/office/drawing/2016/5/14/chartex" xmlns:mc="http://schemas.openxmlformats.org/markup-compatibility/2006" xmlns:aink="http://schemas.microsoft.com/office/drawing/2016/ink" xmlns:am3d="http://schemas.microsoft.com/office/drawing/2017/model3d" xmlns:o="urn:schemas-microsoft-com:office:office" xmlns:oel="http://schemas.microsoft.com/office/2019/extlst" xmlns:r="http://purl.oclc.org/ooxml/officeDocument/relationships" xmlns:m="http://purl.oclc.org/ooxml/officeDocument/math" xmlns:v="urn:schemas-microsoft-com:vml" xmlns:wp14="http://schemas.microsoft.com/office/word/2010/wordprocessingDrawing" xmlns:wp="http://purl.oclc.org/ooxml/drawingml/wordprocessingDrawing" xmlns:w10="urn:schemas-microsoft-com:office:word" xmlns:w="http://purl.oclc.org/ooxml/wordprocessingml/main" xmlns:w14="http://schemas.microsoft.com/office/word/2010/wordml" xmlns:w15="http://schemas.microsoft.com/office/word/2012/wordml" xmlns:w16cex="http://schemas.microsoft.com/office/word/2018/wordml/cex" xmlns:w16cid="http://schemas.microsoft.com/office/word/2016/wordml/cid" xmlns:w16="http://schemas.microsoft.com/office/word/2018/wordml" xmlns:w16du="http://schemas.microsoft.com/office/word/2023/wordml/word16du" xmlns:w16sdtdh="http://schemas.microsoft.com/office/word/2020/wordml/sdtdatahash" xmlns:w16sdtfl="http://schemas.microsoft.com/office/word/2024/wordml/sdtformatlock" xmlns:w16se="http://schemas.microsoft.com/office/word/2015/wordml/symex" xmlns:wpi="http://schemas.microsoft.com/office/word/2010/wordprocessingInk" xmlns:wne="http://schemas.microsoft.com/office/word/2006/wordml" mc:Ignorable="w14 w15 w16se w16cid w16 w16cex w16sdtdh w16sdtfl w16du wne wp14">
+<w:numbering xmlns:cx="http://schemas.microsoft.com/office/drawing/2014/chartex" xmlns:cx1="http://schemas.microsoft.com/office/drawing/2015/9/8/chartex" xmlns:cx2="http://schemas.microsoft.com/office/drawing/2015/10/21/chartex" xmlns:cx3="http://schemas.microsoft.com/office/drawing/2016/5/9/chartex" xmlns:cx4="http://schemas.microsoft.com/office/drawing/2016/5/10/chartex" xmlns:cx5="http://schemas.microsoft.com/office/drawing/2016/5/11/chartex" xmlns:cx6="http://schemas.microsoft.com/office/drawing/2016/5/12/chartex" xmlns:cx7="http://schemas.microsoft.com/office/drawing/2016/5/13/chartex" xmlns:cx8="http://schemas.microsoft.com/office/drawing/2016/5/14/chartex" xmlns:mc="http://schemas.openxmlformats.org/markup-compatibility/2006" xmlns:aink="http://schemas.microsoft.com/office/drawing/2016/ink" xmlns:am3d="http://schemas.microsoft.com/office/drawing/2017/model3d" xmlns:o="urn:schemas-microsoft-com:office:office" xmlns:r="http://purl.oclc.org/ooxml/officeDocument/relationships" xmlns:m="http://purl.oclc.org/ooxml/officeDocument/math" xmlns:v="urn:schemas-microsoft-com:vml" xmlns:wp14="http://schemas.microsoft.com/office/word/2010/wordprocessingDrawing" xmlns:wp="http://purl.oclc.org/ooxml/drawingml/wordprocessingDrawing" xmlns:w10="urn:schemas-microsoft-com:office:word" xmlns:w="http://purl.oclc.org/ooxml/wordprocessingml/main" xmlns:w14="http://schemas.microsoft.com/office/word/2010/wordml" xmlns:w15="http://schemas.microsoft.com/office/word/2012/wordml" xmlns:w16cex="http://schemas.microsoft.com/office/word/2018/wordml/cex" xmlns:w16cid="http://schemas.microsoft.com/office/word/2016/wordml/cid" xmlns:w16="http://schemas.microsoft.com/office/word/2018/wordml" xmlns:w16sdtdh="http://schemas.microsoft.com/office/word/2020/wordml/sdtdatahash" xmlns:w16se="http://schemas.microsoft.com/office/word/2015/wordml/symex" xmlns:wpi="http://schemas.microsoft.com/office/word/2010/wordprocessingInk" xmlns:wne="http://schemas.microsoft.com/office/word/2006/wordml" mc:Ignorable="w14 w15 w16se w16cid w16 w16cex w16sdtdh wne wp14">
   <w:abstractNum w:abstractNumId="0" w15:restartNumberingAfterBreak="0">
     <w:nsid w:val="FFFFFF1D"/>
     <w:multiLevelType w:val="multilevel"/>
@@ -6940,122 +6897,122 @@
       </w:rPr>
     </w:lvl>
   </w:abstractNum>
-  <w:num w:numId="1" w16cid:durableId="1668897967">
+  <w:num w:numId="1">
     <w:abstractNumId w:val="19"/>
   </w:num>
-  <w:num w:numId="2" w16cid:durableId="649099233">
+  <w:num w:numId="2">
     <w:abstractNumId w:val="29"/>
   </w:num>
-  <w:num w:numId="3" w16cid:durableId="1258296120">
+  <w:num w:numId="3">
     <w:abstractNumId w:val="18"/>
   </w:num>
-  <w:num w:numId="4" w16cid:durableId="1530531391">
+  <w:num w:numId="4">
     <w:abstractNumId w:val="21"/>
   </w:num>
-  <w:num w:numId="5" w16cid:durableId="4676369">
+  <w:num w:numId="5">
     <w:abstractNumId w:val="21"/>
   </w:num>
-  <w:num w:numId="6" w16cid:durableId="1454860574">
+  <w:num w:numId="6">
     <w:abstractNumId w:val="21"/>
   </w:num>
-  <w:num w:numId="7" w16cid:durableId="1759669929">
+  <w:num w:numId="7">
     <w:abstractNumId w:val="21"/>
   </w:num>
-  <w:num w:numId="8" w16cid:durableId="1961103964">
+  <w:num w:numId="8">
     <w:abstractNumId w:val="26"/>
   </w:num>
-  <w:num w:numId="9" w16cid:durableId="99185256">
+  <w:num w:numId="9">
     <w:abstractNumId w:val="30"/>
   </w:num>
-  <w:num w:numId="10" w16cid:durableId="462191269">
+  <w:num w:numId="10">
     <w:abstractNumId w:val="20"/>
   </w:num>
-  <w:num w:numId="11" w16cid:durableId="179319863">
+  <w:num w:numId="11">
     <w:abstractNumId w:val="16"/>
   </w:num>
-  <w:num w:numId="12" w16cid:durableId="414785148">
+  <w:num w:numId="12">
     <w:abstractNumId w:val="15"/>
   </w:num>
-  <w:num w:numId="13" w16cid:durableId="407265432">
+  <w:num w:numId="13">
     <w:abstractNumId w:val="0"/>
   </w:num>
-  <w:num w:numId="14" w16cid:durableId="295066257">
+  <w:num w:numId="14">
     <w:abstractNumId w:val="10"/>
   </w:num>
-  <w:num w:numId="15" w16cid:durableId="1880389060">
+  <w:num w:numId="15">
     <w:abstractNumId w:val="8"/>
   </w:num>
-  <w:num w:numId="16" w16cid:durableId="1325667432">
+  <w:num w:numId="16">
     <w:abstractNumId w:val="7"/>
   </w:num>
-  <w:num w:numId="17" w16cid:durableId="2024548284">
+  <w:num w:numId="17">
     <w:abstractNumId w:val="6"/>
   </w:num>
-  <w:num w:numId="18" w16cid:durableId="310141041">
+  <w:num w:numId="18">
     <w:abstractNumId w:val="5"/>
   </w:num>
-  <w:num w:numId="19" w16cid:durableId="382170933">
+  <w:num w:numId="19">
     <w:abstractNumId w:val="9"/>
   </w:num>
-  <w:num w:numId="20" w16cid:durableId="129445487">
+  <w:num w:numId="20">
     <w:abstractNumId w:val="4"/>
   </w:num>
-  <w:num w:numId="21" w16cid:durableId="783160171">
+  <w:num w:numId="21">
     <w:abstractNumId w:val="3"/>
   </w:num>
-  <w:num w:numId="22" w16cid:durableId="1689871000">
+  <w:num w:numId="22">
     <w:abstractNumId w:val="2"/>
   </w:num>
-  <w:num w:numId="23" w16cid:durableId="1280796404">
+  <w:num w:numId="23">
     <w:abstractNumId w:val="1"/>
   </w:num>
-  <w:num w:numId="24" w16cid:durableId="1171018995">
+  <w:num w:numId="24">
     <w:abstractNumId w:val="22"/>
   </w:num>
-  <w:num w:numId="25" w16cid:durableId="2108429281">
+  <w:num w:numId="25">
     <w:abstractNumId w:val="24"/>
   </w:num>
-  <w:num w:numId="26" w16cid:durableId="124125624">
+  <w:num w:numId="26">
     <w:abstractNumId w:val="14"/>
   </w:num>
-  <w:num w:numId="27" w16cid:durableId="1137840947">
+  <w:num w:numId="27">
     <w:abstractNumId w:val="23"/>
   </w:num>
-  <w:num w:numId="28" w16cid:durableId="827016957">
+  <w:num w:numId="28">
     <w:abstractNumId w:val="17"/>
   </w:num>
-  <w:num w:numId="29" w16cid:durableId="595482689">
+  <w:num w:numId="29">
     <w:abstractNumId w:val="11"/>
   </w:num>
-  <w:num w:numId="30" w16cid:durableId="34430954">
+  <w:num w:numId="30">
     <w:abstractNumId w:val="27"/>
   </w:num>
-  <w:num w:numId="31" w16cid:durableId="373580082">
+  <w:num w:numId="31">
     <w:abstractNumId w:val="33"/>
   </w:num>
-  <w:num w:numId="32" w16cid:durableId="770468062">
+  <w:num w:numId="32">
     <w:abstractNumId w:val="28"/>
   </w:num>
-  <w:num w:numId="33" w16cid:durableId="785587381">
+  <w:num w:numId="33">
     <w:abstractNumId w:val="13"/>
   </w:num>
-  <w:num w:numId="34" w16cid:durableId="1803040897">
+  <w:num w:numId="34">
     <w:abstractNumId w:val="31"/>
   </w:num>
-  <w:num w:numId="35" w16cid:durableId="1379015608">
+  <w:num w:numId="35">
     <w:abstractNumId w:val="12"/>
   </w:num>
-  <w:num w:numId="36" w16cid:durableId="170996815">
+  <w:num w:numId="36">
     <w:abstractNumId w:val="32"/>
   </w:num>
-  <w:num w:numId="37" w16cid:durableId="410466172">
+  <w:num w:numId="37">
     <w:abstractNumId w:val="25"/>
   </w:num>
 </w:numbering>
 </file>
 
 <file path=word/styles.xml><?xml version="1.0" encoding="utf-8"?>
-<w:styles xmlns:mc="http://schemas.openxmlformats.org/markup-compatibility/2006" xmlns:r="http://purl.oclc.org/ooxml/officeDocument/relationships" xmlns:w="http://purl.oclc.org/ooxml/wordprocessingml/main" xmlns:w14="http://schemas.microsoft.com/office/word/2010/wordml" xmlns:w15="http://schemas.microsoft.com/office/word/2012/wordml" xmlns:w16cex="http://schemas.microsoft.com/office/word/2018/wordml/cex" xmlns:w16cid="http://schemas.microsoft.com/office/word/2016/wordml/cid" xmlns:w16="http://schemas.microsoft.com/office/word/2018/wordml" xmlns:w16du="http://schemas.microsoft.com/office/word/2023/wordml/word16du" xmlns:w16sdtdh="http://schemas.microsoft.com/office/word/2020/wordml/sdtdatahash" xmlns:w16sdtfl="http://schemas.microsoft.com/office/word/2024/wordml/sdtformatlock" xmlns:w16se="http://schemas.microsoft.com/office/word/2015/wordml/symex" mc:Ignorable="w14 w15 w16se w16cid w16 w16cex w16sdtdh w16sdtfl w16du">
+<w:styles xmlns:mc="http://schemas.openxmlformats.org/markup-compatibility/2006" xmlns:r="http://purl.oclc.org/ooxml/officeDocument/relationships" xmlns:w="http://purl.oclc.org/ooxml/wordprocessingml/main" xmlns:w14="http://schemas.microsoft.com/office/word/2010/wordml" xmlns:w15="http://schemas.microsoft.com/office/word/2012/wordml" xmlns:w16cex="http://schemas.microsoft.com/office/word/2018/wordml/cex" xmlns:w16cid="http://schemas.microsoft.com/office/word/2016/wordml/cid" xmlns:w16="http://schemas.microsoft.com/office/word/2018/wordml" xmlns:w16sdtdh="http://schemas.microsoft.com/office/word/2020/wordml/sdtdatahash" xmlns:w16se="http://schemas.microsoft.com/office/word/2015/wordml/symex" mc:Ignorable="w14 w15 w16se w16cid w16 w16cex w16sdtdh">
   <w:docDefaults>
     <w:rPrDefault>
       <w:rPr>

</xml_diff>